<commit_message>
docs: preserve REC-01 v1.0 owner refinements
</commit_message>
<xml_diff>
--- a/doc/customer-docs/working/exports/REC-01-VISIT-REPORT-PL-v1.0.docx
+++ b/doc/customer-docs/working/exports/REC-01-VISIT-REPORT-PL-v1.0.docx
@@ -204,15 +204,7 @@
                 <w:sz w:val="21"/>
                 <w:lang w:val="pl-PL"/>
               </w:rPr>
-              <w:t xml:space="preserve">ZAKRES RAPORTU: Ten raport nie jest umową, diagnozą techniczną ani certyfikatem stanu nieruchomości. Dokumentuje widoczne fakty z konkretnej wizyty. Zakres wynika z SCO-01 lub późniejszego pisemnego potwierdzenia.</w:t>
-            </w:r>
-            <w:r>
-              <w:rPr>
-                <w:rFonts w:eastAsia="Calibri"/>
-                <w:sz w:val="21"/>
-                <w:lang w:val="pl-PL"/>
-              </w:rPr>
-              <w:t/>
+              <w:t>ZAKRES RAPORTU: Ten raport nie jest umową, diagnozą techniczną ani certyfikatem stanu nieruchomości. Dokumentuje widoczne fakty z konkretnej wizyty. Zakres wynika z SCO-01 lub późniejszego pisemnego potwierdzenia.</w:t>
             </w:r>
           </w:p>
         </w:tc>
@@ -381,34 +373,6 @@
               </w:rPr>
               <w:t>☐ lokal gotowy</w:t>
             </w:r>
-            <w:r>
-              <w:rPr>
-                <w:lang w:val="pl-PL"/>
-              </w:rPr>
-              <w:br/>
-            </w:r>
-            <w:r>
-              <w:rPr>
-                <w:rFonts w:eastAsia="Calibri"/>
-                <w:sz w:val="19"/>
-                <w:lang w:val="pl-PL"/>
-              </w:rPr>
-              <w:t/>
-            </w:r>
-            <w:r>
-              <w:rPr>
-                <w:lang w:val="pl-PL"/>
-              </w:rPr>
-              <w:br/>
-            </w:r>
-            <w:r>
-              <w:rPr>
-                <w:rFonts w:eastAsia="Calibri"/>
-                <w:sz w:val="19"/>
-                <w:lang w:val="pl-PL"/>
-              </w:rPr>
-              <w:t/>
-            </w:r>
           </w:p>
           <w:p>
             <w:pPr>
@@ -425,34 +389,6 @@
               </w:rPr>
               <w:t>☐ gotowy z uwagami</w:t>
             </w:r>
-            <w:r>
-              <w:rPr>
-                <w:lang w:val="pl-PL"/>
-              </w:rPr>
-              <w:br/>
-            </w:r>
-            <w:r>
-              <w:rPr>
-                <w:rFonts w:eastAsia="Calibri"/>
-                <w:sz w:val="19"/>
-                <w:lang w:val="pl-PL"/>
-              </w:rPr>
-              <w:t/>
-            </w:r>
-            <w:r>
-              <w:rPr>
-                <w:lang w:val="pl-PL"/>
-              </w:rPr>
-              <w:br/>
-            </w:r>
-            <w:r>
-              <w:rPr>
-                <w:rFonts w:eastAsia="Calibri"/>
-                <w:sz w:val="19"/>
-                <w:lang w:val="pl-PL"/>
-              </w:rPr>
-              <w:t/>
-            </w:r>
           </w:p>
           <w:p>
             <w:pPr>
@@ -467,35 +403,7 @@
                 <w:sz w:val="19"/>
                 <w:lang w:val="pl-PL"/>
               </w:rPr>
-              <w:t>☐ decyzja właściciela wymagana</w:t>
-            </w:r>
-            <w:r>
-              <w:rPr>
-                <w:lang w:val="pl-PL"/>
-              </w:rPr>
-              <w:br/>
-            </w:r>
-            <w:r>
-              <w:rPr>
-                <w:rFonts w:eastAsia="Calibri"/>
-                <w:sz w:val="19"/>
-                <w:lang w:val="pl-PL"/>
-              </w:rPr>
-              <w:t/>
-            </w:r>
-            <w:r>
-              <w:rPr>
-                <w:lang w:val="pl-PL"/>
-              </w:rPr>
-              <w:br/>
-            </w:r>
-            <w:r>
-              <w:rPr>
-                <w:rFonts w:eastAsia="Calibri"/>
-                <w:sz w:val="19"/>
-                <w:lang w:val="pl-PL"/>
-              </w:rPr>
-              <w:t/>
+              <w:t>☐ dalsza obserwacja</w:t>
             </w:r>
           </w:p>
           <w:p>
@@ -511,79 +419,7 @@
                 <w:sz w:val="19"/>
                 <w:lang w:val="pl-PL"/>
               </w:rPr>
-              <w:t>☐ dalsza obserwacja</w:t>
-            </w:r>
-            <w:r>
-              <w:rPr>
-                <w:lang w:val="pl-PL"/>
-              </w:rPr>
-              <w:br/>
-            </w:r>
-            <w:r>
-              <w:rPr>
-                <w:rFonts w:eastAsia="Calibri"/>
-                <w:sz w:val="19"/>
-                <w:lang w:val="pl-PL"/>
-              </w:rPr>
-              <w:t/>
-            </w:r>
-            <w:r>
-              <w:rPr>
-                <w:lang w:val="pl-PL"/>
-              </w:rPr>
-              <w:br/>
-            </w:r>
-            <w:r>
-              <w:rPr>
-                <w:rFonts w:eastAsia="Calibri"/>
-                <w:sz w:val="19"/>
-                <w:lang w:val="pl-PL"/>
-              </w:rPr>
-              <w:t/>
-            </w:r>
-          </w:p>
-          <w:p>
-            <w:pPr>
-              <w:spacing w:after="0" w:line="276" w:lineRule="auto"/>
-              <w:rPr>
-                <w:lang w:val="pl-PL"/>
-              </w:rPr>
-            </w:pPr>
-            <w:r>
-              <w:rPr>
-                <w:rFonts w:eastAsia="Calibri"/>
-                <w:sz w:val="19"/>
-                <w:lang w:val="pl-PL"/>
-              </w:rPr>
-              <w:t>☐ wizyta częściowo wykonana / niewykonana</w:t>
-            </w:r>
-            <w:r>
-              <w:rPr>
-                <w:lang w:val="pl-PL"/>
-              </w:rPr>
-              <w:br/>
-            </w:r>
-            <w:r>
-              <w:rPr>
-                <w:rFonts w:eastAsia="Calibri"/>
-                <w:sz w:val="19"/>
-                <w:lang w:val="pl-PL"/>
-              </w:rPr>
-              <w:t/>
-            </w:r>
-            <w:r>
-              <w:rPr>
-                <w:lang w:val="pl-PL"/>
-              </w:rPr>
-              <w:br/>
-            </w:r>
-            <w:r>
-              <w:rPr>
-                <w:rFonts w:eastAsia="Calibri"/>
-                <w:sz w:val="19"/>
-                <w:lang w:val="pl-PL"/>
-              </w:rPr>
-              <w:t/>
+              <w:t>☐ wizyta częściowo wykonana</w:t>
             </w:r>
           </w:p>
         </w:tc>
@@ -962,7 +798,23 @@
                 <w:rFonts w:eastAsia="Calibri"/>
                 <w:sz w:val="21"/>
               </w:rPr>
-              <w:t xml:space="preserve"> podejmuje się nowych płatnych działań.</w:t>
+              <w:t xml:space="preserve"> </w:t>
+            </w:r>
+            <w:proofErr w:type="spellStart"/>
+            <w:r>
+              <w:rPr>
+                <w:rFonts w:eastAsia="Calibri"/>
+                <w:sz w:val="21"/>
+              </w:rPr>
+              <w:t>podejmuje</w:t>
+            </w:r>
+            <w:proofErr w:type="spellEnd"/>
+            <w:r>
+              <w:rPr>
+                <w:rFonts w:eastAsia="Calibri"/>
+                <w:sz w:val="21"/>
+              </w:rPr>
+              <w:t xml:space="preserve"> się nowych płatnych działań.</w:t>
             </w:r>
           </w:p>
         </w:tc>
@@ -1767,31 +1619,10 @@
               <w:br/>
             </w:r>
             <w:r>
-              <w:rPr>
-                <w:rFonts w:eastAsia="Calibri"/>
-                <w:sz w:val="19"/>
-              </w:rPr>
-              <w:t/>
-            </w:r>
-            <w:r>
               <w:br/>
             </w:r>
             <w:r>
-              <w:rPr>
-                <w:rFonts w:eastAsia="Calibri"/>
-                <w:sz w:val="19"/>
-              </w:rPr>
-              <w:t/>
-            </w:r>
-            <w:r>
               <w:br/>
-            </w:r>
-            <w:r>
-              <w:rPr>
-                <w:rFonts w:eastAsia="Calibri"/>
-                <w:sz w:val="19"/>
-              </w:rPr>
-              <w:t/>
             </w:r>
           </w:p>
           <w:p>
@@ -1809,31 +1640,10 @@
               <w:br/>
             </w:r>
             <w:r>
-              <w:rPr>
-                <w:rFonts w:eastAsia="Calibri"/>
-                <w:sz w:val="19"/>
-              </w:rPr>
-              <w:t/>
-            </w:r>
-            <w:r>
               <w:br/>
             </w:r>
             <w:r>
-              <w:rPr>
-                <w:rFonts w:eastAsia="Calibri"/>
-                <w:sz w:val="19"/>
-              </w:rPr>
-              <w:t/>
-            </w:r>
-            <w:r>
               <w:br/>
-            </w:r>
-            <w:r>
-              <w:rPr>
-                <w:rFonts w:eastAsia="Calibri"/>
-                <w:sz w:val="19"/>
-              </w:rPr>
-              <w:t/>
             </w:r>
           </w:p>
           <w:p>
@@ -1851,31 +1661,10 @@
               <w:br/>
             </w:r>
             <w:r>
-              <w:rPr>
-                <w:rFonts w:eastAsia="Calibri"/>
-                <w:sz w:val="19"/>
-              </w:rPr>
-              <w:t/>
-            </w:r>
-            <w:r>
               <w:br/>
             </w:r>
             <w:r>
-              <w:rPr>
-                <w:rFonts w:eastAsia="Calibri"/>
-                <w:sz w:val="19"/>
-              </w:rPr>
-              <w:t/>
-            </w:r>
-            <w:r>
               <w:br/>
-            </w:r>
-            <w:r>
-              <w:rPr>
-                <w:rFonts w:eastAsia="Calibri"/>
-                <w:sz w:val="19"/>
-              </w:rPr>
-              <w:t/>
             </w:r>
           </w:p>
           <w:p>
@@ -1893,31 +1682,10 @@
               <w:br/>
             </w:r>
             <w:r>
-              <w:rPr>
-                <w:rFonts w:eastAsia="Calibri"/>
-                <w:sz w:val="19"/>
-              </w:rPr>
-              <w:t/>
-            </w:r>
-            <w:r>
               <w:br/>
             </w:r>
             <w:r>
-              <w:rPr>
-                <w:rFonts w:eastAsia="Calibri"/>
-                <w:sz w:val="19"/>
-              </w:rPr>
-              <w:t/>
-            </w:r>
-            <w:r>
               <w:br/>
-            </w:r>
-            <w:r>
-              <w:rPr>
-                <w:rFonts w:eastAsia="Calibri"/>
-                <w:sz w:val="19"/>
-              </w:rPr>
-              <w:t/>
             </w:r>
           </w:p>
         </w:tc>
@@ -2092,7 +1860,6 @@
                 <w:sz w:val="19"/>
                 <w:lang w:val="pl-PL"/>
               </w:rPr>
-              <w:lastRenderedPageBreak/>
               <w:t>Co było w zakresie tej wizyty</w:t>
             </w:r>
           </w:p>
@@ -2731,6 +2498,7 @@
                 <w:rFonts w:eastAsia="Calibri"/>
                 <w:sz w:val="19"/>
               </w:rPr>
+              <w:lastRenderedPageBreak/>
               <w:t>Metoda dostępu</w:t>
             </w:r>
           </w:p>
@@ -3879,6 +3647,7 @@
                 <w:sz w:val="18"/>
                 <w:lang w:val="pl-PL"/>
               </w:rPr>
+              <w:lastRenderedPageBreak/>
               <w:t>Zawory / wyłączniki (jeśli widoczne i istotne)</w:t>
             </w:r>
           </w:p>
@@ -4260,7 +4029,6 @@
                 <w:sz w:val="19"/>
                 <w:lang w:val="pl-PL"/>
               </w:rPr>
-              <w:lastRenderedPageBreak/>
               <w:t>Sprzątanie / gotowość w tej wizycie</w:t>
             </w:r>
           </w:p>
@@ -4320,8 +4088,17 @@
                 <w:rFonts w:eastAsia="Calibri"/>
                 <w:sz w:val="19"/>
               </w:rPr>
-              <w:t xml:space="preserve"> dotyczy</w:t>
-            </w:r>
+              <w:t xml:space="preserve"> </w:t>
+            </w:r>
+            <w:proofErr w:type="spellStart"/>
+            <w:r>
+              <w:rPr>
+                <w:rFonts w:eastAsia="Calibri"/>
+                <w:sz w:val="19"/>
+              </w:rPr>
+              <w:t>dotyczy</w:t>
+            </w:r>
+            <w:proofErr w:type="spellEnd"/>
           </w:p>
         </w:tc>
       </w:tr>
@@ -4837,6 +4614,7 @@
                 <w:rFonts w:eastAsia="Calibri"/>
                 <w:sz w:val="19"/>
               </w:rPr>
+              <w:lastRenderedPageBreak/>
               <w:t>ID uwagi</w:t>
             </w:r>
           </w:p>
@@ -5322,7 +5100,6 @@
                 <w:rFonts w:eastAsia="Calibri"/>
                 <w:sz w:val="19"/>
               </w:rPr>
-              <w:lastRenderedPageBreak/>
               <w:t>Dowód</w:t>
             </w:r>
             <w:proofErr w:type="spellEnd"/>
@@ -5810,6 +5587,7 @@
                 <w:rFonts w:eastAsia="Calibri"/>
                 <w:sz w:val="21"/>
               </w:rPr>
+              <w:lastRenderedPageBreak/>
               <w:t>reakcji</w:t>
             </w:r>
             <w:proofErr w:type="spellEnd"/>
@@ -5940,122 +5718,6 @@
                 <w:rFonts w:eastAsia="Calibri"/>
                 <w:sz w:val="19"/>
               </w:rPr>
-              <w:t>Referencja zestawu dowodów / archiwum</w:t>
-            </w:r>
-            <w:proofErr w:type="spellEnd"/>
-            <w:r>
-              <w:rPr>
-                <w:rFonts w:eastAsia="Calibri"/>
-                <w:sz w:val="19"/>
-              </w:rPr>
-              <w:t xml:space="preserve"/>
-            </w:r>
-            <w:proofErr w:type="spellStart"/>
-            <w:r>
-              <w:rPr>
-                <w:rFonts w:eastAsia="Calibri"/>
-                <w:sz w:val="19"/>
-              </w:rPr>
-              <w:t/>
-            </w:r>
-            <w:proofErr w:type="spellEnd"/>
-            <w:r>
-              <w:rPr>
-                <w:rFonts w:eastAsia="Calibri"/>
-                <w:sz w:val="19"/>
-              </w:rPr>
-              <w:t xml:space="preserve"/>
-            </w:r>
-            <w:proofErr w:type="spellStart"/>
-            <w:r>
-              <w:rPr>
-                <w:rFonts w:eastAsia="Calibri"/>
-                <w:sz w:val="19"/>
-              </w:rPr>
-              <w:t/>
-            </w:r>
-            <w:proofErr w:type="spellEnd"/>
-          </w:p>
-        </w:tc>
-        <w:tc>
-          <w:tcPr>
-            <w:tcW w:w="6760" w:type="dxa"/>
-            <w:tcMar>
-              <w:top w:w="90" w:type="dxa"/>
-              <w:left w:w="130" w:type="dxa"/>
-              <w:bottom w:w="90" w:type="dxa"/>
-              <w:right w:w="130" w:type="dxa"/>
-            </w:tcMar>
-            <w:vAlign w:val="center"/>
-          </w:tcPr>
-          <w:p>
-            <w:pPr>
-              <w:spacing w:after="0" w:line="276" w:lineRule="auto"/>
-              <w:rPr>
-                <w:lang w:val="pl-PL"/>
-              </w:rPr>
-            </w:pPr>
-            <w:r>
-              <w:rPr>
-                <w:rFonts w:eastAsia="Calibri"/>
-                <w:sz w:val="19"/>
-                <w:lang w:val="pl-PL"/>
-              </w:rPr>
-              <w:t>______</w:t>
-            </w:r>
-            <w:r>
-              <w:rPr>
-                <w:lang w:val="pl-PL"/>
-              </w:rPr>
-              <w:br/>
-            </w:r>
-            <w:r>
-              <w:rPr>
-                <w:rFonts w:eastAsia="Calibri"/>
-                <w:sz w:val="19"/>
-                <w:lang w:val="pl-PL"/>
-              </w:rPr>
-              <w:t/>
-            </w:r>
-            <w:r>
-              <w:rPr>
-                <w:lang w:val="pl-PL"/>
-              </w:rPr>
-              <w:br/>
-            </w:r>
-            <w:r>
-              <w:rPr>
-                <w:rFonts w:eastAsia="Calibri"/>
-                <w:sz w:val="19"/>
-                <w:lang w:val="pl-PL"/>
-              </w:rPr>
-              <w:t/>
-            </w:r>
-          </w:p>
-        </w:tc>
-      </w:tr>
-      <w:tr>
-        <w:tc>
-          <w:tcPr>
-            <w:tcW w:w="2600" w:type="dxa"/>
-            <w:tcMar>
-              <w:top w:w="90" w:type="dxa"/>
-              <w:left w:w="130" w:type="dxa"/>
-              <w:bottom w:w="90" w:type="dxa"/>
-              <w:right w:w="130" w:type="dxa"/>
-            </w:tcMar>
-            <w:vAlign w:val="center"/>
-          </w:tcPr>
-          <w:p>
-            <w:pPr>
-              <w:spacing w:after="0" w:line="276" w:lineRule="auto"/>
-            </w:pPr>
-            <w:proofErr w:type="spellStart"/>
-            <w:r>
-              <w:rPr>
-                <w:rFonts w:eastAsia="Calibri"/>
-                <w:sz w:val="19"/>
-              </w:rPr>
               <w:t>Wybrane</w:t>
             </w:r>
             <w:proofErr w:type="spellEnd"/>
@@ -6348,7 +6010,6 @@
           <w:sz w:val="21"/>
           <w:lang w:val="pl-PL"/>
         </w:rPr>
-        <w:lastRenderedPageBreak/>
         <w:t>Nie fotografować (pogrupowane dla czytelności — wszystkie pozycje obowiązują):</w:t>
       </w:r>
     </w:p>
@@ -6749,6 +6410,7 @@
                 <w:rFonts w:eastAsia="Calibri"/>
                 <w:sz w:val="19"/>
               </w:rPr>
+              <w:lastRenderedPageBreak/>
               <w:t>Dostarczono do</w:t>
             </w:r>
           </w:p>
@@ -7265,18 +6927,27 @@
     <w:pPr>
       <w:pStyle w:val="Nagwek"/>
       <w:rPr>
-        <w:lang w:val="pl-PL"/>
+        <w:lang w:val="en-GB"/>
       </w:rPr>
     </w:pPr>
-    <w:proofErr w:type="spellStart"/>
     <w:r>
       <w:rPr>
         <w:rFonts w:eastAsia="Calibri"/>
         <w:color w:val="5F6774"/>
         <w:sz w:val="17"/>
-        <w:lang w:val="pl-PL"/>
-      </w:rPr>
-      <w:t>Sentinel</w:t>
+        <w:lang w:val="en-GB"/>
+      </w:rPr>
+      <w:t xml:space="preserve">Sentinel Costa Blanca | REC-01 </w:t>
+    </w:r>
+    <w:proofErr w:type="spellStart"/>
+    <w:r>
+      <w:rPr>
+        <w:rFonts w:eastAsia="Calibri"/>
+        <w:color w:val="5F6774"/>
+        <w:sz w:val="17"/>
+        <w:lang w:val="en-GB"/>
+      </w:rPr>
+      <w:t>Raport</w:t>
     </w:r>
     <w:proofErr w:type="spellEnd"/>
     <w:r>
@@ -7284,9 +6955,29 @@
         <w:rFonts w:eastAsia="Calibri"/>
         <w:color w:val="5F6774"/>
         <w:sz w:val="17"/>
-        <w:lang w:val="pl-PL"/>
-      </w:rPr>
-      <w:t xml:space="preserve"> Costa Blanca | REC-01 Raport wizyty </w:t>
+        <w:lang w:val="en-GB"/>
+      </w:rPr>
+      <w:t xml:space="preserve"> </w:t>
+    </w:r>
+    <w:proofErr w:type="spellStart"/>
+    <w:r>
+      <w:rPr>
+        <w:rFonts w:eastAsia="Calibri"/>
+        <w:color w:val="5F6774"/>
+        <w:sz w:val="17"/>
+        <w:lang w:val="en-GB"/>
+      </w:rPr>
+      <w:t>wizyty</w:t>
+    </w:r>
+    <w:proofErr w:type="spellEnd"/>
+    <w:r>
+      <w:rPr>
+        <w:rFonts w:eastAsia="Calibri"/>
+        <w:color w:val="5F6774"/>
+        <w:sz w:val="17"/>
+        <w:lang w:val="en-GB"/>
+      </w:rPr>
+      <w:t xml:space="preserve"> </w:t>
     </w:r>
   </w:p>
 </w:hdr>

</xml_diff>